<commit_message>
Refactor branding and UI components across the application.
</commit_message>
<xml_diff>
--- a/json2docx/resume_template/Grant/resume.docx
+++ b/json2docx/resume_template/Grant/resume.docx
@@ -45,9 +45,8 @@
           <w:sz w:val="26"/>
           <w:szCs w:val="26"/>
         </w:rPr>
-        <w:t>&lt;&lt;</w:t>
-      </w:r>
-      <w:proofErr w:type="spellStart"/>
+        <w:t>&lt;&lt;Profile_</w:t>
+      </w:r>
       <w:r>
         <w:rPr>
           <w:rFonts w:ascii="Aptos" w:hAnsi="Aptos" w:cstheme="minorHAnsi"/>
@@ -56,7 +55,7 @@
           <w:sz w:val="26"/>
           <w:szCs w:val="26"/>
         </w:rPr>
-        <w:t>Profile_</w:t>
+        <w:t>T</w:t>
       </w:r>
       <w:r>
         <w:rPr>
@@ -66,7 +65,7 @@
           <w:sz w:val="26"/>
           <w:szCs w:val="26"/>
         </w:rPr>
-        <w:t>T</w:t>
+        <w:t>itle&gt;&gt; | &lt;&lt;Small_</w:t>
       </w:r>
       <w:r>
         <w:rPr>
@@ -76,9 +75,8 @@
           <w:sz w:val="26"/>
           <w:szCs w:val="26"/>
         </w:rPr>
-        <w:t>itle</w:t>
-      </w:r>
-      <w:proofErr w:type="spellEnd"/>
+        <w:t>T</w:t>
+      </w:r>
       <w:r>
         <w:rPr>
           <w:rFonts w:ascii="Aptos" w:hAnsi="Aptos" w:cstheme="minorHAnsi"/>
@@ -87,49 +85,7 @@
           <w:sz w:val="26"/>
           <w:szCs w:val="26"/>
         </w:rPr>
-        <w:t>&gt;&gt; | &lt;&lt;</w:t>
-      </w:r>
-      <w:proofErr w:type="spellStart"/>
-      <w:r>
-        <w:rPr>
-          <w:rFonts w:ascii="Aptos" w:hAnsi="Aptos" w:cstheme="minorHAnsi"/>
-          <w:b/>
-          <w:bCs/>
-          <w:sz w:val="26"/>
-          <w:szCs w:val="26"/>
-        </w:rPr>
-        <w:t>Small_</w:t>
-      </w:r>
-      <w:r>
-        <w:rPr>
-          <w:rFonts w:ascii="Aptos" w:hAnsi="Aptos" w:cstheme="minorHAnsi"/>
-          <w:b/>
-          <w:bCs/>
-          <w:sz w:val="26"/>
-          <w:szCs w:val="26"/>
-        </w:rPr>
-        <w:t>T</w:t>
-      </w:r>
-      <w:r>
-        <w:rPr>
-          <w:rFonts w:ascii="Aptos" w:hAnsi="Aptos" w:cstheme="minorHAnsi"/>
-          <w:b/>
-          <w:bCs/>
-          <w:sz w:val="26"/>
-          <w:szCs w:val="26"/>
-        </w:rPr>
-        <w:t>itle</w:t>
-      </w:r>
-      <w:proofErr w:type="spellEnd"/>
-      <w:r>
-        <w:rPr>
-          <w:rFonts w:ascii="Aptos" w:hAnsi="Aptos" w:cstheme="minorHAnsi"/>
-          <w:b/>
-          <w:bCs/>
-          <w:sz w:val="26"/>
-          <w:szCs w:val="26"/>
-        </w:rPr>
-        <w:t>&gt;&gt;</w:t>
+        <w:t>itle&gt;&gt;</w:t>
       </w:r>
     </w:p>
     <w:p>
@@ -758,7 +714,14 @@
           <w:rFonts w:ascii="Aptos" w:hAnsi="Aptos" w:cstheme="minorHAnsi"/>
           <w:color w:val="404040" w:themeColor="text1" w:themeTint="BF"/>
         </w:rPr>
-        <w:t>Jun 2026</w:t>
+        <w:t>Aug</w:t>
+      </w:r>
+      <w:r>
+        <w:rPr>
+          <w:rFonts w:ascii="Aptos" w:hAnsi="Aptos" w:cstheme="minorHAnsi"/>
+          <w:color w:val="404040" w:themeColor="text1" w:themeTint="BF"/>
+        </w:rPr>
+        <w:t xml:space="preserve"> 2026</w:t>
       </w:r>
       <w:r>
         <w:rPr>
@@ -1555,7 +1518,7 @@
           <w:rFonts w:ascii="Aptos" w:hAnsi="Aptos" w:cstheme="minorHAnsi"/>
           <w:color w:val="404040" w:themeColor="text1" w:themeTint="BF"/>
         </w:rPr>
-        <w:t>June</w:t>
+        <w:t>Jun</w:t>
       </w:r>
       <w:r>
         <w:rPr>

</xml_diff>